<commit_message>
moved to microsoft SQL
</commit_message>
<xml_diff>
--- a/Prompt/Maintenance rule for this repository.docx
+++ b/Prompt/Maintenance rule for this repository.docx
@@ -107,8 +107,13 @@
         <w:pStyle w:val="NoSpacing"/>
       </w:pPr>
       <w:r>
-        <w:t>- Database Schema/database-schema.sql</w:t>
-      </w:r>
+        <w:t>- Database Schema/database-</w:t>
+      </w:r>
+      <w:proofErr w:type="spellStart"/>
+      <w:r>
+        <w:t>schema.sql</w:t>
+      </w:r>
+      <w:proofErr w:type="spellEnd"/>
     </w:p>
     <w:p>
       <w:pPr>
@@ -160,8 +165,13 @@
         <w:pStyle w:val="NoSpacing"/>
       </w:pPr>
       <w:r>
-        <w:t>- Database Schema/database-schema.sql</w:t>
-      </w:r>
+        <w:t>- Database Schema/database-</w:t>
+      </w:r>
+      <w:proofErr w:type="spellStart"/>
+      <w:r>
+        <w:t>schema.sql</w:t>
+      </w:r>
+      <w:proofErr w:type="spellEnd"/>
     </w:p>
     <w:p>
       <w:pPr>
@@ -381,28 +391,44 @@
         <w:pStyle w:val="NoSpacing"/>
       </w:pPr>
       <w:r>
-        <w:t>- Database Schema/database-schema.sql as the full latest schema for fresh installs</w:t>
-      </w:r>
-    </w:p>
-    <w:p>
-      <w:pPr>
-        <w:pStyle w:val="NoSpacing"/>
-      </w:pPr>
-      <w:r>
-        <w:t>- Database Schema/migrations/*.sql as the incremental upgrade path for existing databases</w:t>
-      </w:r>
-    </w:p>
-    <w:p>
-      <w:pPr>
-        <w:pStyle w:val="NoSpacing"/>
-      </w:pPr>
-    </w:p>
-    <w:p>
-      <w:pPr>
-        <w:pStyle w:val="NoSpacing"/>
-      </w:pPr>
-      <w:r>
-        <w:t xml:space="preserve">You must always ensure the data files account for sufficient data to populate a read database. </w:t>
+        <w:t>- Database Schema/database-</w:t>
+      </w:r>
+      <w:proofErr w:type="spellStart"/>
+      <w:r>
+        <w:t>schema.sql</w:t>
+      </w:r>
+      <w:proofErr w:type="spellEnd"/>
+      <w:r>
+        <w:t xml:space="preserve"> as the full latest schema for fresh installs</w:t>
+      </w:r>
+    </w:p>
+    <w:p>
+      <w:pPr>
+        <w:pStyle w:val="NoSpacing"/>
+      </w:pPr>
+      <w:r>
+        <w:t>- Database Schema/migrations/*.</w:t>
+      </w:r>
+      <w:proofErr w:type="spellStart"/>
+      <w:r>
+        <w:t>sql</w:t>
+      </w:r>
+      <w:proofErr w:type="spellEnd"/>
+      <w:r>
+        <w:t xml:space="preserve"> as the incremental upgrade path for existing databases</w:t>
+      </w:r>
+    </w:p>
+    <w:p>
+      <w:pPr>
+        <w:pStyle w:val="NoSpacing"/>
+      </w:pPr>
+    </w:p>
+    <w:p>
+      <w:pPr>
+        <w:pStyle w:val="NoSpacing"/>
+      </w:pPr>
+      <w:r>
+        <w:t>You must always ensure the data files account for sufficient data to populate a database from scratch when needed.</w:t>
       </w:r>
     </w:p>
     <w:p>
@@ -427,7 +453,22 @@
         <w:t>”</w:t>
       </w:r>
       <w:r>
-        <w:t xml:space="preserve"> as needed to reflect changes in the database schema, and ensure data is loaded into the database. </w:t>
+        <w:t xml:space="preserve"> as needed to reflect changes in the database schema</w:t>
+      </w:r>
+      <w:r>
+        <w:t>, or other database artefacts</w:t>
+      </w:r>
+      <w:r>
+        <w:t xml:space="preserve"> and ensure data is loaded into the database. </w:t>
+      </w:r>
+      <w:r>
+        <w:t xml:space="preserve">If new data is </w:t>
+      </w:r>
+      <w:r>
+        <w:t>needed, populate</w:t>
+      </w:r>
+      <w:r>
+        <w:t xml:space="preserve"> the database with new data as needed and update the database schema directory artefacts as needed to align with the database changes.</w:t>
       </w:r>
     </w:p>
     <w:p>

</xml_diff>

<commit_message>
Cleaned up directory REPO folders and files
</commit_message>
<xml_diff>
--- a/Prompt/Maintenance rule for this repository.docx
+++ b/Prompt/Maintenance rule for this repository.docx
@@ -276,6 +276,105 @@
         <w:pStyle w:val="NoSpacing"/>
       </w:pPr>
       <w:r>
+        <w:t xml:space="preserve">You must always update when needed the </w:t>
+      </w:r>
+      <w:proofErr w:type="spellStart"/>
+      <w:r>
+        <w:t>sourcecode</w:t>
+      </w:r>
+      <w:proofErr w:type="spellEnd"/>
+      <w:r>
+        <w:t>\project\Dependencies</w:t>
+      </w:r>
+      <w:r>
+        <w:t xml:space="preserve"> artefacts as needed, particularly:</w:t>
+      </w:r>
+    </w:p>
+    <w:p>
+      <w:pPr>
+        <w:pStyle w:val="NoSpacing"/>
+      </w:pPr>
+      <w:r>
+        <w:t>-</w:t>
+      </w:r>
+      <w:r>
+        <w:t xml:space="preserve"> compile.cmd</w:t>
+      </w:r>
+    </w:p>
+    <w:p>
+      <w:pPr>
+        <w:pStyle w:val="NoSpacing"/>
+      </w:pPr>
+      <w:r>
+        <w:t>-</w:t>
+      </w:r>
+      <w:r>
+        <w:t xml:space="preserve"> README.md</w:t>
+      </w:r>
+    </w:p>
+    <w:p>
+      <w:pPr>
+        <w:pStyle w:val="NoSpacing"/>
+      </w:pPr>
+      <w:r>
+        <w:t>-</w:t>
+      </w:r>
+      <w:r>
+        <w:t>dependencies.txt</w:t>
+      </w:r>
+    </w:p>
+    <w:p>
+      <w:pPr>
+        <w:pStyle w:val="NoSpacing"/>
+      </w:pPr>
+      <w:r>
+        <w:t>-</w:t>
+      </w:r>
+      <w:r>
+        <w:rPr>
+          <w:rFonts w:ascii="Segoe UI" w:hAnsi="Segoe UI" w:cs="Segoe UI"/>
+          <w:color w:val="BBBEBF"/>
+          <w:sz w:val="20"/>
+          <w:szCs w:val="20"/>
+        </w:rPr>
+        <w:t xml:space="preserve"> </w:t>
+      </w:r>
+      <w:r>
+        <w:t>CreateDB.cmd</w:t>
+      </w:r>
+    </w:p>
+    <w:p>
+      <w:pPr>
+        <w:pStyle w:val="NoSpacing"/>
+      </w:pPr>
+      <w:r>
+        <w:t>-</w:t>
+      </w:r>
+      <w:r>
+        <w:rPr>
+          <w:rFonts w:ascii="Segoe UI" w:hAnsi="Segoe UI" w:cs="Segoe UI"/>
+          <w:color w:val="BBBEBF"/>
+          <w:sz w:val="20"/>
+          <w:szCs w:val="20"/>
+        </w:rPr>
+        <w:t xml:space="preserve"> </w:t>
+      </w:r>
+      <w:proofErr w:type="spellStart"/>
+      <w:r>
+        <w:t>DB_config</w:t>
+      </w:r>
+      <w:proofErr w:type="spellEnd"/>
+    </w:p>
+    <w:p>
+      <w:pPr>
+        <w:pStyle w:val="NoSpacing"/>
+      </w:pPr>
+    </w:p>
+    <w:p>
+      <w:pPr>
+        <w:pStyle w:val="NoSpacing"/>
+      </w:pPr>
+      <w:r>
         <w:t>The repository must always remain able to:</w:t>
       </w:r>
     </w:p>
@@ -308,6 +407,7 @@
         <w:pStyle w:val="NoSpacing"/>
       </w:pPr>
       <w:r>
+        <w:lastRenderedPageBreak/>
         <w:t>- map and import source data into the schema</w:t>
       </w:r>
     </w:p>
@@ -369,7 +469,6 @@
         <w:pStyle w:val="NoSpacing"/>
       </w:pPr>
       <w:r>
-        <w:lastRenderedPageBreak/>
         <w:t>- compileApp.cmd still builds the current app fully offline on Windows</w:t>
       </w:r>
     </w:p>
@@ -441,19 +540,7 @@
         <w:pStyle w:val="NoSpacing"/>
       </w:pPr>
       <w:r>
-        <w:t xml:space="preserve">You must always update the application database </w:t>
-      </w:r>
-      <w:r>
-        <w:t>“</w:t>
-      </w:r>
-      <w:r>
-        <w:t>Server=localhost\SQLEXPRESS;Database=master;Trusted_Connection=True;</w:t>
-      </w:r>
-      <w:r>
-        <w:t>”</w:t>
-      </w:r>
-      <w:r>
-        <w:t xml:space="preserve"> as needed to reflect changes in the database schema</w:t>
+        <w:t>You must always update the application database as needed to reflect changes in the database schema</w:t>
       </w:r>
       <w:r>
         <w:t>, or other database artefacts</w:t>
@@ -510,7 +597,13 @@
         <w:t xml:space="preserve">- whether </w:t>
       </w:r>
       <w:r>
-        <w:t>Dependency artefacts</w:t>
+        <w:t>Dependencies</w:t>
+      </w:r>
+      <w:r>
+        <w:t xml:space="preserve"> </w:t>
+      </w:r>
+      <w:r>
+        <w:t>artefacts</w:t>
       </w:r>
       <w:r>
         <w:t xml:space="preserve"> were updated</w:t>
@@ -521,7 +614,10 @@
         <w:pStyle w:val="NoSpacing"/>
       </w:pPr>
       <w:r>
-        <w:t>- why those updates were or were not required</w:t>
+        <w:t>-</w:t>
+      </w:r>
+      <w:r>
+        <w:t xml:space="preserve"> why those updates were or were not required</w:t>
       </w:r>
     </w:p>
     <w:p>

</xml_diff>